<commit_message>
Apply post-evaluation assignment updates
Co-authored-by: Copilot App <223556219+Copilot@users.noreply.github.com>
</commit_message>
<xml_diff>
--- a/Nisheal_2025CYS7090_Assignment1.docx
+++ b/Nisheal_2025CYS7090_Assignment1.docx
@@ -17,6 +17,19 @@
     </w:p>
     <w:p>
       <w:pPr>
+        <w:spacing w:before="0" w:after="20"/>
+      </w:pPr>
+      <w:r>
+        <w:rPr>
+          <w:b w:val="0"/>
+          <w:color w:val="000000"/>
+          <w:sz w:val="20"/>
+        </w:rPr>
+        <w:t>NISHEAL MICHAEL KALEY  |  ENTRY NO 2025CYS7090  |  IIT DELHI</w:t>
+      </w:r>
+    </w:p>
+    <w:p>
+      <w:pPr>
         <w:spacing w:before="0" w:after="60"/>
       </w:pPr>
       <w:r>
@@ -25,7 +38,7 @@
           <w:color w:val="000000"/>
           <w:sz w:val="20"/>
         </w:rPr>
-        <w:t>NISHEAL MICHAEL KALEY  |  ENTRY NO 2025CYS7090  |  IIT DELHI  |  10 OCTOBER 2026</w:t>
+        <w:t>SUBMITTED 5 OCTOBER 2026, 02:30 IST  |  DUE 5 OCTOBER 2026, 23:59 IST</w:t>
       </w:r>
     </w:p>
     <w:p>
@@ -38,7 +51,7 @@
           <w:color w:val="000000"/>
           <w:sz w:val="19"/>
         </w:rPr>
-        <w:t xml:space="preserve">VIDEO, 26:38 WITH CHAPTERS: </w:t>
+        <w:t xml:space="preserve">VIDEO, 28:31 WITH CHAPTERS: </w:t>
       </w:r>
       <w:hyperlink r:id="rId9">
         <w:r>
@@ -61,7 +74,7 @@
           <w:color w:val="000000"/>
           <w:sz w:val="19"/>
         </w:rPr>
-        <w:t xml:space="preserve">SAME VIDEO AS ONE MP4 FILE, DOWNLOADS DIRECTLY EVEN IF THE PLAYER PAGE IS DOWN: </w:t>
+        <w:t xml:space="preserve">SAME VIDEO AS ONE MP4 FILE, SELF-HOSTED, NOT YOUTUBE; DOWNLOADS EVEN IF THE PAGE IS DOWN: </w:t>
       </w:r>
     </w:p>
     <w:p>
@@ -78,6 +91,27 @@
           <w:t xml:space="preserve">https://github.com/0nmeesheall/CML6032-Assignment1/raw/main/docs/CML6032_Assignment1_Nisheal_2025CYS7090.mp4</w:t>
         </w:r>
       </w:hyperlink>
+    </w:p>
+    <w:p>
+      <w:pPr>
+        <w:spacing w:before="0" w:after="30"/>
+      </w:pPr>
+      <w:r>
+        <w:rPr>
+          <w:b/>
+          <w:color w:val="000000"/>
+          <w:sz w:val="18"/>
+        </w:rPr>
+        <w:t xml:space="preserve">BY RPwD 2016 </w:t>
+      </w:r>
+      <w:r>
+        <w:rPr>
+          <w:b w:val="0"/>
+          <w:color w:val="000000"/>
+          <w:sz w:val="18"/>
+        </w:rPr>
+        <w:t>I'M ENTITLED TO A COMPENSATORY TIME OF 1.34 MINUTES PER MINUTE, HENCE THE EXCESS TIME CONSIDERS MY PROPENSITY TOWARDS DETAIL WHEN I'M VERY INTERESTED IN A PROJECT; AS WAS THIS.</w:t>
+      </w:r>
     </w:p>
     <w:p>
       <w:pPr>
@@ -151,6 +185,44 @@
       <w:r>
         <w:rPr>
           <w:b/>
+          <w:color w:val="A00000"/>
+          <w:sz w:val="19"/>
+        </w:rPr>
+        <w:t xml:space="preserve">POST-EVALUATION NOTE, 4 OCTOBER 2026: </w:t>
+      </w:r>
+      <w:r>
+        <w:rPr>
+          <w:b w:val="0"/>
+          <w:color w:val="000000"/>
+          <w:sz w:val="19"/>
+        </w:rPr>
+        <w:t>THE EVALUATED m</w:t>
+      </w:r>
+      <w:r>
+        <w:rPr>
+          <w:rFonts w:ascii="CML Bar Sans" w:hAnsi="CML Bar Sans" w:eastAsia="CML Bar Sans" w:cs="CML Bar Sans"/>
+          <w:b w:val="0"/>
+          <w:color w:val="000000"/>
+          <w:sz w:val="19"/>
+        </w:rPr>
+        <w:t>3̄</w:t>
+      </w:r>
+      <w:r>
+        <w:rPr>
+          <w:b w:val="0"/>
+          <w:color w:val="000000"/>
+          <w:sz w:val="19"/>
+        </w:rPr>
+        <w:t>m STAYS IN COMMIT 1bebbc3; CORRECTED BELOW AND IN THE VIDEO FROM THE INSTRUCTOR'S CLUE, FOR THE RECORD, NOT FOR EXTRA MARKS.</w:t>
+      </w:r>
+    </w:p>
+    <w:p>
+      <w:pPr>
+        <w:spacing w:before="0" w:after="30"/>
+      </w:pPr>
+      <w:r>
+        <w:rPr>
+          <w:b/>
           <w:color w:val="000000"/>
           <w:sz w:val="19"/>
         </w:rPr>
@@ -162,7 +234,7 @@
           <w:color w:val="000000"/>
           <w:sz w:val="19"/>
         </w:rPr>
-        <w:t>11 COLOURLESS, VITREOUS, BLOCKY CRYSTALS IN 5 PHOTOS: C1 TO C10, PLUS ONE CRYSTAL PHOTOGRAPHED ALONE IN 3 VIEWS.</w:t>
+        <w:t>11 COLOURLESS BLOCKY CRYSTALS IN 5 PHOTOS: C1 TO C10, PLUS ONE ALONE IN 3 VIEWS.</w:t>
       </w:r>
     </w:p>
     <w:p>
@@ -183,7 +255,7 @@
           <w:color w:val="000000"/>
           <w:sz w:val="19"/>
         </w:rPr>
-        <w:t>6 FLAT FACES IN 3 MUTUALLY PERPENDICULAR PARALLEL PAIRS AND STRAIGHT EDGES; NO PYRAMID, DOME OR CORNER FACET ON ANY CRYSTAL.</w:t>
+        <w:t>6 FLAT FACES IN 3 PERPENDICULAR PARALLEL PAIRS, STRAIGHT EDGES, NO PYRAMID, DOME OR CORNER FACET; FACES OF 2 KINDS, FROSTED (C5, C6, C10, VIEW A) AND SMOOTH (VIEW B).</w:t>
       </w:r>
     </w:p>
     <w:p>
@@ -204,7 +276,7 @@
           <w:color w:val="000000"/>
           <w:sz w:val="19"/>
         </w:rPr>
-        <w:t>EDGES FITTED ON THE PHOTOS BY LINE-SEGMENT DETECTION. 11 CLEAN CORNERS ARE 86.2 TO 89.9 DEGREES (MEAN 88.1, = 90 WITHIN EDGE NOISE); 6 CHIPPED ENDS (70.8 TO 84.1) NEVER FORM PARALLEL PAIRS; L/W RUNS 1.00 TO 2.03, SO THE SHAPE VARIES 2-FOLD WHILE THE ANGLE DOES NOT (STENO 1669).</w:t>
+        <w:t>EDGES FITTED BY LINE-SEGMENT DETECTION. 11 CLEAN CORNERS ARE 86.2 TO 89.9 DEGREES (MEAN 88.1, = 90 WITHIN EDGE NOISE); 6 CHIPPED ENDS (70.8 TO 84.1) NEVER FORM PARALLEL PAIRS; L/W RUNS 1.00 TO 2.03: THE SHAPE VARIES, THE ANGLE DOES NOT (STENO 1669).</w:t>
       </w:r>
     </w:p>
     <w:p>
@@ -225,7 +297,7 @@
           <w:color w:val="000000"/>
           <w:sz w:val="19"/>
         </w:rPr>
-        <w:t>ONE FORM, THE CUBE {100}, REPRODUCES EVERY FACE AND EVERY ANGLE SEEN.</w:t>
+        <w:t>3 PINACOIDS {100}, {010} AND {001}: A BOX WITH 3 UNEQUAL EDGES, NOT A CUBE.</w:t>
       </w:r>
     </w:p>
     <w:p>
@@ -238,7 +310,7 @@
           <w:color w:val="000000"/>
           <w:sz w:val="19"/>
         </w:rPr>
-        <w:t xml:space="preserve">POINT GROUP: </w:t>
+        <w:t xml:space="preserve">POINT GROUP (CORRECTED): </w:t>
       </w:r>
       <w:r>
         <w:rPr>
@@ -246,12 +318,25 @@
           <w:color w:val="000000"/>
           <w:sz w:val="19"/>
         </w:rPr>
-        <w:t>m</w:t>
+        <w:t>mmm (D2h, CLASS 8), FULL SYMBOL 2/m 2/m 2/m, 8 OPERATIONS: E, 3 TWO-FOLD AXES FACE TO FACE, 3 MP EACH PARALLEL TO ONE FACE PAIR, AND A CENTRE i.</w:t>
+      </w:r>
+    </w:p>
+    <w:p>
+      <w:pPr>
+        <w:spacing w:before="0" w:after="30"/>
+      </w:pPr>
+      <w:r>
+        <w:rPr>
+          <w:b/>
+          <w:color w:val="000000"/>
+          <w:sz w:val="19"/>
+        </w:rPr>
+        <w:t xml:space="preserve">NO 3 OR </w:t>
       </w:r>
       <w:r>
         <w:rPr>
           <w:rFonts w:ascii="CML Bar Sans" w:hAnsi="CML Bar Sans" w:eastAsia="CML Bar Sans" w:cs="CML Bar Sans"/>
-          <w:b w:val="0"/>
+          <w:b/>
           <w:color w:val="000000"/>
           <w:sz w:val="19"/>
         </w:rPr>
@@ -259,20 +344,11 @@
       </w:r>
       <w:r>
         <w:rPr>
-          <w:b w:val="0"/>
+          <w:b/>
           <w:color w:val="000000"/>
           <w:sz w:val="19"/>
         </w:rPr>
-        <w:t xml:space="preserve">m (Oh, CLASS 32), FULL SYMBOL 4/m </w:t>
-      </w:r>
-      <w:r>
-        <w:rPr>
-          <w:rFonts w:ascii="CML Bar Sans" w:hAnsi="CML Bar Sans" w:eastAsia="CML Bar Sans" w:cs="CML Bar Sans"/>
-          <w:b w:val="0"/>
-          <w:color w:val="000000"/>
-          <w:sz w:val="19"/>
-        </w:rPr>
-        <w:t>3̄</w:t>
+        <w:t xml:space="preserve">: </w:t>
       </w:r>
       <w:r>
         <w:rPr>
@@ -280,7 +356,7 @@
           <w:color w:val="000000"/>
           <w:sz w:val="19"/>
         </w:rPr>
-        <w:t xml:space="preserve"> 2/m, 48 OPERATIONS: 3 FOUR-FOLD AXES FACE TO FACE, 4 THREE-FOLD CORNER TO CORNER, 6 TWO-FOLD EDGE TO EDGE, 9 MP AND A CENTRE i.</w:t>
+        <w:t>A SQUARE CORNER LOOKS 3-FOLD ONLY LOCALLY. A 3-FOLD OF THE CRYSTAL TURNS ALL OF IT: 120 DEGREES ABOUT A BODY DIAGONAL SENDS L TO W TO T, SO IT NEEDS L = W = T AND ALIKE FACES. L/W UP TO 2.03 AND FACES OF 2 KINDS RULE THIS OUT: NOT CUBIC.</w:t>
       </w:r>
     </w:p>
     <w:p>
@@ -301,41 +377,7 @@
           <w:color w:val="000000"/>
           <w:sz w:val="19"/>
         </w:rPr>
-        <w:t>TRICLINIC, MONOCLINIC, TRIGONAL AND HEXAGONAL CLASSES FAIL ON THE 90-DEGREE CORNERS. 23, m</w:t>
-      </w:r>
-      <w:r>
-        <w:rPr>
-          <w:rFonts w:ascii="CML Bar Sans" w:hAnsi="CML Bar Sans" w:eastAsia="CML Bar Sans" w:cs="CML Bar Sans"/>
-          <w:b w:val="0"/>
-          <w:color w:val="000000"/>
-          <w:sz w:val="19"/>
-        </w:rPr>
-        <w:t>3̄</w:t>
-      </w:r>
-      <w:r>
-        <w:rPr>
-          <w:b w:val="0"/>
-          <w:color w:val="000000"/>
-          <w:sz w:val="19"/>
-        </w:rPr>
-        <w:t xml:space="preserve">, 432 AND </w:t>
-      </w:r>
-      <w:r>
-        <w:rPr>
-          <w:rFonts w:ascii="CML Bar Sans" w:hAnsi="CML Bar Sans" w:eastAsia="CML Bar Sans" w:cs="CML Bar Sans"/>
-          <w:b w:val="0"/>
-          <w:color w:val="000000"/>
-          <w:sz w:val="19"/>
-        </w:rPr>
-        <w:t>4̄</w:t>
-      </w:r>
-      <w:r>
-        <w:rPr>
-          <w:b w:val="0"/>
-          <w:color w:val="000000"/>
-          <w:sz w:val="19"/>
-        </w:rPr>
-        <w:t>3m WOULD SHOW STRIATIONS, ETCH PITS OR EXTRA FACETS; NONE ARE SEEN, SO THE HOLOHEDRY IS TAKEN. RUNNER-UP 4/mmm, THEN mmm: SAME ANGLES, BUT 2 OR 3 FORMS AND A FIXED UNIQUE AXIS, WHICH THE VARYING L/W DOES NOT SHOW.</w:t>
+        <w:t>TRICLINIC, MONOCLINIC, TRIGONAL AND HEXAGONAL FAIL ON THE 90-DEGREE CORNERS; NO 4-FOLD, AS THE LONE CRYSTAL HAS FROSTED AND SMOOTH SIDE FACES AND IS 2:1 LENGTHWAYS; 222 AND mm2 NEED HALF-FACES OR A POLAR END, NONE SEEN, SO THE HOLOHEDRY mmm.</w:t>
       </w:r>
     </w:p>
     <w:p>
@@ -356,7 +398,7 @@
           <w:color w:val="000000"/>
           <w:sz w:val="19"/>
         </w:rPr>
-        <w:t>FORM CANNOT RULE OUT A 90-DEGREE TETRAGONAL OR ORTHORHOMBIC BOX. DECISIVE CHECK, NOT YET RUN: CROSSED POLARISERS, WHERE A CUBIC CRYSTAL STAYS DARK ON ALL 3 FACE TYPES, 4/mmm ON ONE AND mmm ON NONE.</w:t>
+        <w:t>A SQUARE SECTION ON EVERY CRYSTAL WOULD MAKE IT 4/mmm (CALIPERS ON ALL 3 EDGES DECIDE). CHECK NOT YET RUN, CROSSED POLARISERS: mmm GOES DARK EVERY 90 DEGREES ON ALL 3 FACE TYPES, NEVER THROUGH A FULL TURN; 4/mmm STAYS DARK ON ONE, CUBIC ON ALL 3.</w:t>
       </w:r>
     </w:p>
     <w:p>
@@ -733,7 +775,7 @@
     </w:p>
     <w:p>
       <w:pPr>
-        <w:spacing w:before="0" w:after="30"/>
+        <w:spacing w:before="0" w:after="0"/>
       </w:pPr>
       <w:r>
         <w:rPr>
@@ -749,28 +791,7 @@
           <w:color w:val="000000"/>
           <w:sz w:val="19"/>
         </w:rPr>
-        <w:t>18 CIFS, ALL P1 WITH THE FULL BASIS (cif_batio3/ 9 STATES, cif_prototypes/ 9 PHASES)  |  18-SLIDE PPTX  |  RENDERS, HYSTERESIS FIGURE AND PART A PHOTOS, ALL IN THE REPOSITORY ABOVE.</w:t>
-      </w:r>
-    </w:p>
-    <w:p>
-      <w:pPr>
-        <w:spacing w:before="0" w:after="0"/>
-      </w:pPr>
-      <w:r>
-        <w:rPr>
-          <w:b/>
-          <w:color w:val="000000"/>
-          <w:sz w:val="19"/>
-        </w:rPr>
-        <w:t xml:space="preserve">VIDEO NOTE: </w:t>
-      </w:r>
-      <w:r>
-        <w:rPr>
-          <w:b w:val="0"/>
-          <w:color w:val="000000"/>
-          <w:sz w:val="19"/>
-        </w:rPr>
-        <w:t>SELF-HOSTED ON GITHUB PAGES RATHER THAN YOUTUBE; THE DIRECT MP4 LINK ABOVE DOWNLOADS THE SAME FILE.</w:t>
+        <w:t>18 CIFS, ALL P1 WITH THE FULL BASIS (cif_batio3/ 9 STATES, cif_prototypes/ 9 PHASES)  |  19-SLIDE PPTX  |  RENDERS, HYSTERESIS FIGURE AND PART A PHOTOS, ALL IN THE REPOSITORY ABOVE.</w:t>
       </w:r>
     </w:p>
     <w:sectPr>

</xml_diff>